<commit_message>
update corrected docx.file and ER diagram for homework 2
</commit_message>
<xml_diff>
--- a/homework2_db/vet_clinic_db_report.docx
+++ b/homework2_db/vet_clinic_db_report.docx
@@ -217,7 +217,6 @@
           <w:lang w:val="en-US"/>
         </w:rPr>
       </w:pPr>
-      <w:proofErr w:type="spellStart"/>
       <w:r>
         <w:rPr>
           <w:rFonts w:ascii="Arial" w:hAnsi="Arial" w:cs="Arial"/>
@@ -227,7 +226,6 @@
         </w:rPr>
         <w:t>pet_owners</w:t>
       </w:r>
-      <w:proofErr w:type="spellEnd"/>
     </w:p>
     <w:p>
       <w:pPr>
@@ -376,7 +374,6 @@
         </w:rPr>
         <w:t xml:space="preserve">Table name – </w:t>
       </w:r>
-      <w:proofErr w:type="spellStart"/>
       <w:r>
         <w:rPr>
           <w:rFonts w:ascii="Arial" w:hAnsi="Arial" w:cs="Arial"/>
@@ -395,7 +392,6 @@
         </w:rPr>
         <w:t>_owners</w:t>
       </w:r>
-      <w:proofErr w:type="spellEnd"/>
     </w:p>
     <w:p>
       <w:pPr>
@@ -503,7 +499,6 @@
           <w:lang w:val="en-US"/>
         </w:rPr>
       </w:pPr>
-      <w:proofErr w:type="spellStart"/>
       <w:r>
         <w:rPr>
           <w:rFonts w:ascii="Arial" w:hAnsi="Arial" w:cs="Arial"/>
@@ -522,15 +517,32 @@
         </w:rPr>
         <w:t>owner</w:t>
       </w:r>
-      <w:proofErr w:type="spellEnd"/>
-      <w:r>
-        <w:rPr>
-          <w:rFonts w:ascii="Arial" w:hAnsi="Arial" w:cs="Arial"/>
-          <w:sz w:val="28"/>
-          <w:szCs w:val="28"/>
-          <w:lang w:val="en-US"/>
-        </w:rPr>
-        <w:t>: INT, PK, NOT NULL, AUTO INCREMENT, UNIQUE</w:t>
+      <w:r>
+        <w:rPr>
+          <w:rFonts w:ascii="Arial" w:hAnsi="Arial" w:cs="Arial"/>
+          <w:sz w:val="28"/>
+          <w:szCs w:val="28"/>
+          <w:lang w:val="en-US"/>
+        </w:rPr>
+        <w:t xml:space="preserve">: INT, PK, NOT NULL, </w:t>
+      </w:r>
+      <w:r>
+        <w:rPr>
+          <w:rFonts w:ascii="Arial" w:hAnsi="Arial" w:cs="Arial"/>
+          <w:sz w:val="28"/>
+          <w:szCs w:val="28"/>
+          <w:lang w:val="en-US"/>
+        </w:rPr>
+        <w:t>SERIAL</w:t>
+      </w:r>
+      <w:r>
+        <w:rPr>
+          <w:rFonts w:ascii="Arial" w:hAnsi="Arial" w:cs="Arial"/>
+          <w:sz w:val="28"/>
+          <w:szCs w:val="28"/>
+          <w:lang w:val="en-US"/>
+        </w:rPr>
+        <w:t>, UNIQUE</w:t>
       </w:r>
     </w:p>
     <w:p>
@@ -547,7 +559,6 @@
           <w:lang w:val="en-US"/>
         </w:rPr>
       </w:pPr>
-      <w:proofErr w:type="spellStart"/>
       <w:r>
         <w:rPr>
           <w:rFonts w:ascii="Arial" w:hAnsi="Arial" w:cs="Arial"/>
@@ -566,27 +577,15 @@
         </w:rPr>
         <w:t>owner</w:t>
       </w:r>
-      <w:proofErr w:type="spellEnd"/>
-      <w:r>
-        <w:rPr>
-          <w:rFonts w:ascii="Arial" w:hAnsi="Arial" w:cs="Arial"/>
-          <w:sz w:val="28"/>
-          <w:szCs w:val="28"/>
-          <w:lang w:val="en-US"/>
-        </w:rPr>
-        <w:t xml:space="preserve">: </w:t>
-      </w:r>
-      <w:proofErr w:type="gramStart"/>
-      <w:r>
-        <w:rPr>
-          <w:rFonts w:ascii="Arial" w:hAnsi="Arial" w:cs="Arial"/>
-          <w:sz w:val="28"/>
-          <w:szCs w:val="28"/>
-          <w:lang w:val="en-US"/>
-        </w:rPr>
-        <w:t>VARCHAR(</w:t>
-      </w:r>
-      <w:proofErr w:type="gramEnd"/>
+      <w:r>
+        <w:rPr>
+          <w:rFonts w:ascii="Arial" w:hAnsi="Arial" w:cs="Arial"/>
+          <w:sz w:val="28"/>
+          <w:szCs w:val="28"/>
+          <w:lang w:val="en-US"/>
+        </w:rPr>
+        <w:t>: VARCHAR(</w:t>
+      </w:r>
       <w:r>
         <w:rPr>
           <w:rFonts w:ascii="Arial" w:hAnsi="Arial" w:cs="Arial"/>
@@ -645,7 +644,16 @@
           <w:szCs w:val="28"/>
           <w:lang w:val="en-US"/>
         </w:rPr>
-        <w:t>INT</w:t>
+        <w:t>VARCHAR</w:t>
+      </w:r>
+      <w:r>
+        <w:rPr>
+          <w:rFonts w:ascii="Arial" w:hAnsi="Arial" w:cs="Arial"/>
+          <w:sz w:val="28"/>
+          <w:szCs w:val="28"/>
+          <w:lang w:val="en-US"/>
+        </w:rPr>
+        <w:t>(20)</w:t>
       </w:r>
     </w:p>
     <w:p>
@@ -796,7 +804,6 @@
           <w:lang w:val="en-US"/>
         </w:rPr>
       </w:pPr>
-      <w:proofErr w:type="spellStart"/>
       <w:r>
         <w:rPr>
           <w:rFonts w:ascii="Arial" w:hAnsi="Arial" w:cs="Arial"/>
@@ -815,15 +822,32 @@
         </w:rPr>
         <w:t>pet</w:t>
       </w:r>
-      <w:proofErr w:type="spellEnd"/>
-      <w:r>
-        <w:rPr>
-          <w:rFonts w:ascii="Arial" w:hAnsi="Arial" w:cs="Arial"/>
-          <w:sz w:val="28"/>
-          <w:szCs w:val="28"/>
-          <w:lang w:val="en-US"/>
-        </w:rPr>
-        <w:t>: INT, PK, NOT NULL, AUTO INCREMENT, UNIQUE</w:t>
+      <w:r>
+        <w:rPr>
+          <w:rFonts w:ascii="Arial" w:hAnsi="Arial" w:cs="Arial"/>
+          <w:sz w:val="28"/>
+          <w:szCs w:val="28"/>
+          <w:lang w:val="en-US"/>
+        </w:rPr>
+        <w:t xml:space="preserve">: INT, PK, NOT NULL, </w:t>
+      </w:r>
+      <w:r>
+        <w:rPr>
+          <w:rFonts w:ascii="Arial" w:hAnsi="Arial" w:cs="Arial"/>
+          <w:sz w:val="28"/>
+          <w:szCs w:val="28"/>
+          <w:lang w:val="en-US"/>
+        </w:rPr>
+        <w:t>SERIAL</w:t>
+      </w:r>
+      <w:r>
+        <w:rPr>
+          <w:rFonts w:ascii="Arial" w:hAnsi="Arial" w:cs="Arial"/>
+          <w:sz w:val="28"/>
+          <w:szCs w:val="28"/>
+          <w:lang w:val="en-US"/>
+        </w:rPr>
+        <w:t>, UNIQUE</w:t>
       </w:r>
     </w:p>
     <w:p>
@@ -840,7 +864,6 @@
           <w:lang w:val="en-US"/>
         </w:rPr>
       </w:pPr>
-      <w:proofErr w:type="spellStart"/>
       <w:r>
         <w:rPr>
           <w:rFonts w:ascii="Arial" w:hAnsi="Arial" w:cs="Arial"/>
@@ -859,27 +882,15 @@
         </w:rPr>
         <w:t>pet</w:t>
       </w:r>
-      <w:proofErr w:type="spellEnd"/>
-      <w:r>
-        <w:rPr>
-          <w:rFonts w:ascii="Arial" w:hAnsi="Arial" w:cs="Arial"/>
-          <w:sz w:val="28"/>
-          <w:szCs w:val="28"/>
-          <w:lang w:val="en-US"/>
-        </w:rPr>
-        <w:t xml:space="preserve">: </w:t>
-      </w:r>
-      <w:proofErr w:type="gramStart"/>
-      <w:r>
-        <w:rPr>
-          <w:rFonts w:ascii="Arial" w:hAnsi="Arial" w:cs="Arial"/>
-          <w:sz w:val="28"/>
-          <w:szCs w:val="28"/>
-          <w:lang w:val="en-US"/>
-        </w:rPr>
-        <w:t>VARCHAR(</w:t>
-      </w:r>
-      <w:proofErr w:type="gramEnd"/>
+      <w:r>
+        <w:rPr>
+          <w:rFonts w:ascii="Arial" w:hAnsi="Arial" w:cs="Arial"/>
+          <w:sz w:val="28"/>
+          <w:szCs w:val="28"/>
+          <w:lang w:val="en-US"/>
+        </w:rPr>
+        <w:t>: VARCHAR(</w:t>
+      </w:r>
       <w:r>
         <w:rPr>
           <w:rFonts w:ascii="Arial" w:hAnsi="Arial" w:cs="Arial"/>
@@ -910,26 +921,196 @@
           <w:rFonts w:ascii="Arial" w:hAnsi="Arial" w:cs="Arial"/>
           <w:sz w:val="28"/>
           <w:szCs w:val="28"/>
-          <w:lang w:val="ru-RU"/>
-        </w:rPr>
-      </w:pPr>
-      <w:r>
-        <w:rPr>
-          <w:rFonts w:ascii="Arial" w:hAnsi="Arial" w:cs="Arial"/>
-          <w:sz w:val="28"/>
-          <w:szCs w:val="28"/>
-          <w:lang w:val="ru-RU"/>
-        </w:rPr>
-        <w:t>diagnosis</w:t>
-      </w:r>
-      <w:r>
-        <w:rPr>
-          <w:rFonts w:ascii="Arial" w:hAnsi="Arial" w:cs="Arial"/>
-          <w:sz w:val="28"/>
-          <w:szCs w:val="28"/>
-          <w:lang w:val="en-US"/>
-        </w:rPr>
-        <w:t>: TEXT, NOT NULL</w:t>
+          <w:lang w:val="en-US"/>
+        </w:rPr>
+      </w:pPr>
+      <w:r>
+        <w:rPr>
+          <w:rFonts w:ascii="Arial" w:hAnsi="Arial" w:cs="Arial"/>
+          <w:sz w:val="28"/>
+          <w:szCs w:val="28"/>
+          <w:lang w:val="en-US"/>
+        </w:rPr>
+        <w:t>id_</w:t>
+      </w:r>
+      <w:r>
+        <w:rPr>
+          <w:rFonts w:ascii="Arial" w:hAnsi="Arial" w:cs="Arial"/>
+          <w:sz w:val="28"/>
+          <w:szCs w:val="28"/>
+          <w:lang w:val="en-US"/>
+        </w:rPr>
+        <w:t>owner</w:t>
+      </w:r>
+      <w:r>
+        <w:rPr>
+          <w:rFonts w:ascii="Arial" w:hAnsi="Arial" w:cs="Arial"/>
+          <w:sz w:val="28"/>
+          <w:szCs w:val="28"/>
+          <w:lang w:val="en-US"/>
+        </w:rPr>
+        <w:t>: INT, FK[p</w:t>
+      </w:r>
+      <w:r>
+        <w:rPr>
+          <w:rFonts w:ascii="Arial" w:hAnsi="Arial" w:cs="Arial"/>
+          <w:sz w:val="28"/>
+          <w:szCs w:val="28"/>
+          <w:lang w:val="en-US"/>
+        </w:rPr>
+        <w:t>et_owners</w:t>
+      </w:r>
+      <w:r>
+        <w:rPr>
+          <w:rFonts w:ascii="Arial" w:hAnsi="Arial" w:cs="Arial"/>
+          <w:sz w:val="28"/>
+          <w:szCs w:val="28"/>
+          <w:lang w:val="en-US"/>
+        </w:rPr>
+        <w:t>]</w:t>
+      </w:r>
+      <w:r>
+        <w:rPr>
+          <w:rFonts w:ascii="Arial" w:hAnsi="Arial" w:cs="Arial"/>
+          <w:sz w:val="28"/>
+          <w:szCs w:val="28"/>
+          <w:lang w:val="en-US"/>
+        </w:rPr>
+        <w:t>, NOT NULL</w:t>
+      </w:r>
+    </w:p>
+    <w:p>
+      <w:pPr>
+        <w:pStyle w:val="ListParagraph"/>
+        <w:numPr>
+          <w:ilvl w:val="0"/>
+          <w:numId w:val="4"/>
+        </w:numPr>
+        <w:rPr>
+          <w:rFonts w:ascii="Arial" w:hAnsi="Arial" w:cs="Arial"/>
+          <w:sz w:val="28"/>
+          <w:szCs w:val="28"/>
+          <w:lang w:val="en-US"/>
+        </w:rPr>
+      </w:pPr>
+      <w:r>
+        <w:rPr>
+          <w:rFonts w:ascii="Arial" w:hAnsi="Arial" w:cs="Arial"/>
+          <w:sz w:val="28"/>
+          <w:szCs w:val="28"/>
+          <w:lang w:val="en-US"/>
+        </w:rPr>
+        <w:t xml:space="preserve">Table name – </w:t>
+      </w:r>
+      <w:r>
+        <w:rPr>
+          <w:rFonts w:ascii="Arial" w:hAnsi="Arial" w:cs="Arial"/>
+          <w:sz w:val="28"/>
+          <w:szCs w:val="28"/>
+          <w:lang w:val="en-US"/>
+        </w:rPr>
+        <w:t>vets</w:t>
+      </w:r>
+    </w:p>
+    <w:p>
+      <w:pPr>
+        <w:pStyle w:val="ListParagraph"/>
+        <w:numPr>
+          <w:ilvl w:val="1"/>
+          <w:numId w:val="4"/>
+        </w:numPr>
+        <w:rPr>
+          <w:rFonts w:ascii="Arial" w:hAnsi="Arial" w:cs="Arial"/>
+          <w:sz w:val="28"/>
+          <w:szCs w:val="28"/>
+          <w:lang w:val="ru-RU"/>
+        </w:rPr>
+      </w:pPr>
+      <w:r>
+        <w:rPr>
+          <w:rFonts w:ascii="Arial" w:hAnsi="Arial" w:cs="Arial"/>
+          <w:i/>
+          <w:iCs/>
+          <w:sz w:val="28"/>
+          <w:szCs w:val="28"/>
+          <w:lang w:val="en-US"/>
+        </w:rPr>
+        <w:t>Description</w:t>
+      </w:r>
+      <w:r>
+        <w:rPr>
+          <w:rFonts w:ascii="Arial" w:hAnsi="Arial" w:cs="Arial"/>
+          <w:sz w:val="28"/>
+          <w:szCs w:val="28"/>
+          <w:lang w:val="ru-RU"/>
+        </w:rPr>
+        <w:t xml:space="preserve">: </w:t>
+      </w:r>
+      <w:r>
+        <w:rPr>
+          <w:rFonts w:ascii="Arial" w:hAnsi="Arial" w:cs="Arial"/>
+          <w:sz w:val="28"/>
+          <w:szCs w:val="28"/>
+          <w:lang w:val="ru-RU"/>
+        </w:rPr>
+        <w:t xml:space="preserve">хранит информацию о </w:t>
+      </w:r>
+      <w:r>
+        <w:rPr>
+          <w:rFonts w:ascii="Arial" w:hAnsi="Arial" w:cs="Arial"/>
+          <w:sz w:val="28"/>
+          <w:szCs w:val="28"/>
+          <w:lang w:val="ru-RU"/>
+        </w:rPr>
+        <w:t>ветеринарах</w:t>
+      </w:r>
+      <w:r>
+        <w:rPr>
+          <w:rFonts w:ascii="Arial" w:hAnsi="Arial" w:cs="Arial"/>
+          <w:sz w:val="28"/>
+          <w:szCs w:val="28"/>
+          <w:lang w:val="ru-RU"/>
+        </w:rPr>
+        <w:t xml:space="preserve"> клиники</w:t>
+      </w:r>
+    </w:p>
+    <w:p>
+      <w:pPr>
+        <w:pStyle w:val="ListParagraph"/>
+        <w:numPr>
+          <w:ilvl w:val="1"/>
+          <w:numId w:val="4"/>
+        </w:numPr>
+        <w:rPr>
+          <w:rFonts w:ascii="Arial" w:hAnsi="Arial" w:cs="Arial"/>
+          <w:i/>
+          <w:iCs/>
+          <w:sz w:val="28"/>
+          <w:szCs w:val="28"/>
+          <w:lang w:val="ru-RU"/>
+        </w:rPr>
+      </w:pPr>
+      <w:r>
+        <w:rPr>
+          <w:rFonts w:ascii="Arial" w:hAnsi="Arial" w:cs="Arial"/>
+          <w:i/>
+          <w:iCs/>
+          <w:sz w:val="28"/>
+          <w:szCs w:val="28"/>
+          <w:lang w:val="en-US"/>
+        </w:rPr>
+        <w:t>Attributes</w:t>
+      </w:r>
+      <w:r>
+        <w:rPr>
+          <w:rFonts w:ascii="Arial" w:hAnsi="Arial" w:cs="Arial"/>
+          <w:i/>
+          <w:iCs/>
+          <w:sz w:val="28"/>
+          <w:szCs w:val="28"/>
+          <w:lang w:val="en-US"/>
+        </w:rPr>
+        <w:t>:</w:t>
       </w:r>
     </w:p>
     <w:p>
@@ -946,7 +1127,6 @@
           <w:lang w:val="en-US"/>
         </w:rPr>
       </w:pPr>
-      <w:proofErr w:type="spellStart"/>
       <w:r>
         <w:rPr>
           <w:rFonts w:ascii="Arial" w:hAnsi="Arial" w:cs="Arial"/>
@@ -963,66 +1143,95 @@
           <w:szCs w:val="28"/>
           <w:lang w:val="en-US"/>
         </w:rPr>
-        <w:t>owner</w:t>
-      </w:r>
-      <w:proofErr w:type="spellEnd"/>
-      <w:r>
-        <w:rPr>
-          <w:rFonts w:ascii="Arial" w:hAnsi="Arial" w:cs="Arial"/>
-          <w:sz w:val="28"/>
-          <w:szCs w:val="28"/>
-          <w:lang w:val="en-US"/>
-        </w:rPr>
-        <w:t xml:space="preserve">: INT, </w:t>
-      </w:r>
-      <w:proofErr w:type="gramStart"/>
-      <w:r>
-        <w:rPr>
-          <w:rFonts w:ascii="Arial" w:hAnsi="Arial" w:cs="Arial"/>
-          <w:sz w:val="28"/>
-          <w:szCs w:val="28"/>
-          <w:lang w:val="en-US"/>
-        </w:rPr>
-        <w:t>FK[</w:t>
-      </w:r>
-      <w:proofErr w:type="spellStart"/>
-      <w:proofErr w:type="gramEnd"/>
-      <w:r>
-        <w:rPr>
-          <w:rFonts w:ascii="Arial" w:hAnsi="Arial" w:cs="Arial"/>
-          <w:sz w:val="28"/>
-          <w:szCs w:val="28"/>
-          <w:lang w:val="en-US"/>
-        </w:rPr>
-        <w:t>p</w:t>
-      </w:r>
-      <w:r>
-        <w:rPr>
-          <w:rFonts w:ascii="Arial" w:hAnsi="Arial" w:cs="Arial"/>
-          <w:sz w:val="28"/>
-          <w:szCs w:val="28"/>
-          <w:lang w:val="en-US"/>
-        </w:rPr>
-        <w:t>et_owners</w:t>
-      </w:r>
-      <w:proofErr w:type="spellEnd"/>
-      <w:r>
-        <w:rPr>
-          <w:rFonts w:ascii="Arial" w:hAnsi="Arial" w:cs="Arial"/>
-          <w:sz w:val="28"/>
-          <w:szCs w:val="28"/>
-          <w:lang w:val="en-US"/>
-        </w:rPr>
-        <w:t>]</w:t>
-      </w:r>
-      <w:r>
-        <w:rPr>
-          <w:rFonts w:ascii="Arial" w:hAnsi="Arial" w:cs="Arial"/>
-          <w:sz w:val="28"/>
-          <w:szCs w:val="28"/>
-          <w:lang w:val="en-US"/>
-        </w:rPr>
-        <w:t>, NOT NULL</w:t>
+        <w:t>vet</w:t>
+      </w:r>
+      <w:r>
+        <w:rPr>
+          <w:rFonts w:ascii="Arial" w:hAnsi="Arial" w:cs="Arial"/>
+          <w:sz w:val="28"/>
+          <w:szCs w:val="28"/>
+          <w:lang w:val="en-US"/>
+        </w:rPr>
+        <w:t>: INT, PK, NOT NULL, UNIQUE</w:t>
+      </w:r>
+    </w:p>
+    <w:p>
+      <w:pPr>
+        <w:pStyle w:val="ListParagraph"/>
+        <w:numPr>
+          <w:ilvl w:val="2"/>
+          <w:numId w:val="4"/>
+        </w:numPr>
+        <w:rPr>
+          <w:rFonts w:ascii="Arial" w:hAnsi="Arial" w:cs="Arial"/>
+          <w:sz w:val="28"/>
+          <w:szCs w:val="28"/>
+          <w:lang w:val="en-US"/>
+        </w:rPr>
+      </w:pPr>
+      <w:r>
+        <w:rPr>
+          <w:rFonts w:ascii="Arial" w:hAnsi="Arial" w:cs="Arial"/>
+          <w:sz w:val="28"/>
+          <w:szCs w:val="28"/>
+          <w:lang w:val="en-US"/>
+        </w:rPr>
+        <w:t>name_</w:t>
+      </w:r>
+      <w:r>
+        <w:rPr>
+          <w:rFonts w:ascii="Arial" w:hAnsi="Arial" w:cs="Arial"/>
+          <w:sz w:val="28"/>
+          <w:szCs w:val="28"/>
+          <w:lang w:val="en-US"/>
+        </w:rPr>
+        <w:t>vet</w:t>
+      </w:r>
+      <w:r>
+        <w:rPr>
+          <w:rFonts w:ascii="Arial" w:hAnsi="Arial" w:cs="Arial"/>
+          <w:sz w:val="28"/>
+          <w:szCs w:val="28"/>
+          <w:lang w:val="en-US"/>
+        </w:rPr>
+        <w:t>: VARCHAR(</w:t>
+      </w:r>
+      <w:r>
+        <w:rPr>
+          <w:rFonts w:ascii="Arial" w:hAnsi="Arial" w:cs="Arial"/>
+          <w:sz w:val="28"/>
+          <w:szCs w:val="28"/>
+          <w:lang w:val="en-US"/>
+        </w:rPr>
+        <w:t>100</w:t>
+      </w:r>
+      <w:r>
+        <w:rPr>
+          <w:rFonts w:ascii="Arial" w:hAnsi="Arial" w:cs="Arial"/>
+          <w:sz w:val="28"/>
+          <w:szCs w:val="28"/>
+          <w:lang w:val="en-US"/>
+        </w:rPr>
+        <w:t>), NOT NULL</w:t>
+      </w:r>
+    </w:p>
+    <w:p>
+      <w:pPr>
+        <w:rPr>
+          <w:rFonts w:ascii="Arial" w:hAnsi="Arial" w:cs="Arial"/>
+          <w:sz w:val="28"/>
+          <w:szCs w:val="28"/>
+          <w:lang w:val="en-US"/>
+        </w:rPr>
+      </w:pPr>
+      <w:r>
+        <w:rPr>
+          <w:rFonts w:ascii="Arial" w:hAnsi="Arial" w:cs="Arial"/>
+          <w:sz w:val="28"/>
+          <w:szCs w:val="28"/>
+          <w:lang w:val="en-US"/>
+        </w:rPr>
+        <w:br w:type="page"/>
       </w:r>
     </w:p>
     <w:p>
@@ -1046,6 +1255,7 @@
           <w:szCs w:val="28"/>
           <w:lang w:val="en-US"/>
         </w:rPr>
+        <w:lastRenderedPageBreak/>
         <w:t xml:space="preserve">Table name – </w:t>
       </w:r>
       <w:r>
@@ -1055,7 +1265,7 @@
           <w:szCs w:val="28"/>
           <w:lang w:val="en-US"/>
         </w:rPr>
-        <w:t>vets</w:t>
+        <w:t>appointments</w:t>
       </w:r>
     </w:p>
     <w:p>
@@ -1108,16 +1318,25 @@
           <w:szCs w:val="28"/>
           <w:lang w:val="ru-RU"/>
         </w:rPr>
-        <w:t>ветеринарах</w:t>
-      </w:r>
-      <w:r>
-        <w:rPr>
-          <w:rFonts w:ascii="Arial" w:hAnsi="Arial" w:cs="Arial"/>
-          <w:sz w:val="28"/>
-          <w:szCs w:val="28"/>
-          <w:lang w:val="ru-RU"/>
-        </w:rPr>
-        <w:t xml:space="preserve"> клиники</w:t>
+        <w:t>приемах к ветерин</w:t>
+      </w:r>
+      <w:r>
+        <w:rPr>
+          <w:rFonts w:ascii="Arial" w:hAnsi="Arial" w:cs="Arial"/>
+          <w:sz w:val="28"/>
+          <w:szCs w:val="28"/>
+          <w:lang w:val="ru-RU"/>
+        </w:rPr>
+        <w:t>а</w:t>
+      </w:r>
+      <w:r>
+        <w:rPr>
+          <w:rFonts w:ascii="Arial" w:hAnsi="Arial" w:cs="Arial"/>
+          <w:sz w:val="28"/>
+          <w:szCs w:val="28"/>
+          <w:lang w:val="ru-RU"/>
+        </w:rPr>
+        <w:t>ру</w:t>
       </w:r>
     </w:p>
     <w:p>
@@ -1173,7 +1392,6 @@
           <w:lang w:val="en-US"/>
         </w:rPr>
       </w:pPr>
-      <w:proofErr w:type="spellStart"/>
       <w:r>
         <w:rPr>
           <w:rFonts w:ascii="Arial" w:hAnsi="Arial" w:cs="Arial"/>
@@ -1190,17 +1408,34 @@
           <w:szCs w:val="28"/>
           <w:lang w:val="en-US"/>
         </w:rPr>
-        <w:t>vet</w:t>
-      </w:r>
-      <w:proofErr w:type="spellEnd"/>
-      <w:r>
-        <w:rPr>
-          <w:rFonts w:ascii="Arial" w:hAnsi="Arial" w:cs="Arial"/>
-          <w:sz w:val="28"/>
-          <w:szCs w:val="28"/>
-          <w:lang w:val="en-US"/>
-        </w:rPr>
-        <w:t>: INT, PK, NOT NULL, UNIQUE</w:t>
+        <w:t>appointment</w:t>
+      </w:r>
+      <w:r>
+        <w:rPr>
+          <w:rFonts w:ascii="Arial" w:hAnsi="Arial" w:cs="Arial"/>
+          <w:sz w:val="28"/>
+          <w:szCs w:val="28"/>
+          <w:lang w:val="en-US"/>
+        </w:rPr>
+        <w:t xml:space="preserve">: INT, PK, NOT NULL, </w:t>
+      </w:r>
+      <w:r>
+        <w:rPr>
+          <w:rFonts w:ascii="Arial" w:hAnsi="Arial" w:cs="Arial"/>
+          <w:sz w:val="28"/>
+          <w:szCs w:val="28"/>
+          <w:lang w:val="en-US"/>
+        </w:rPr>
+        <w:t>SERIAL</w:t>
+      </w:r>
+      <w:r>
+        <w:rPr>
+          <w:rFonts w:ascii="Arial" w:hAnsi="Arial" w:cs="Arial"/>
+          <w:sz w:val="28"/>
+          <w:szCs w:val="28"/>
+          <w:lang w:val="en-US"/>
+        </w:rPr>
+        <w:t>, UNIQUE</w:t>
       </w:r>
     </w:p>
     <w:p>
@@ -1217,26 +1452,15 @@
           <w:lang w:val="en-US"/>
         </w:rPr>
       </w:pPr>
-      <w:proofErr w:type="spellStart"/>
-      <w:r>
-        <w:rPr>
-          <w:rFonts w:ascii="Arial" w:hAnsi="Arial" w:cs="Arial"/>
-          <w:sz w:val="28"/>
-          <w:szCs w:val="28"/>
-          <w:lang w:val="en-US"/>
-        </w:rPr>
-        <w:t>name_</w:t>
-      </w:r>
-      <w:r>
-        <w:rPr>
-          <w:rFonts w:ascii="Arial" w:hAnsi="Arial" w:cs="Arial"/>
-          <w:sz w:val="28"/>
-          <w:szCs w:val="28"/>
-          <w:lang w:val="en-US"/>
-        </w:rPr>
-        <w:t>vet</w:t>
-      </w:r>
-      <w:proofErr w:type="spellEnd"/>
+      <w:r>
+        <w:rPr>
+          <w:rFonts w:ascii="Arial" w:hAnsi="Arial" w:cs="Arial"/>
+          <w:sz w:val="28"/>
+          <w:szCs w:val="28"/>
+          <w:lang w:val="en-US"/>
+        </w:rPr>
+        <w:t>date</w:t>
+      </w:r>
       <w:r>
         <w:rPr>
           <w:rFonts w:ascii="Arial" w:hAnsi="Arial" w:cs="Arial"/>
@@ -1246,53 +1470,263 @@
         </w:rPr>
         <w:t xml:space="preserve">: </w:t>
       </w:r>
-      <w:proofErr w:type="gramStart"/>
-      <w:r>
-        <w:rPr>
-          <w:rFonts w:ascii="Arial" w:hAnsi="Arial" w:cs="Arial"/>
-          <w:sz w:val="28"/>
-          <w:szCs w:val="28"/>
-          <w:lang w:val="en-US"/>
-        </w:rPr>
-        <w:t>VARCHAR(</w:t>
-      </w:r>
-      <w:proofErr w:type="gramEnd"/>
-      <w:r>
-        <w:rPr>
-          <w:rFonts w:ascii="Arial" w:hAnsi="Arial" w:cs="Arial"/>
-          <w:sz w:val="28"/>
-          <w:szCs w:val="28"/>
-          <w:lang w:val="en-US"/>
-        </w:rPr>
-        <w:t>100</w:t>
-      </w:r>
-      <w:r>
-        <w:rPr>
-          <w:rFonts w:ascii="Arial" w:hAnsi="Arial" w:cs="Arial"/>
-          <w:sz w:val="28"/>
-          <w:szCs w:val="28"/>
-          <w:lang w:val="en-US"/>
-        </w:rPr>
-        <w:t>), NOT NULL</w:t>
-      </w:r>
-    </w:p>
-    <w:p>
-      <w:pPr>
-        <w:rPr>
-          <w:rFonts w:ascii="Arial" w:hAnsi="Arial" w:cs="Arial"/>
-          <w:sz w:val="28"/>
-          <w:szCs w:val="28"/>
-          <w:lang w:val="en-US"/>
-        </w:rPr>
-      </w:pPr>
-      <w:r>
-        <w:rPr>
-          <w:rFonts w:ascii="Arial" w:hAnsi="Arial" w:cs="Arial"/>
-          <w:sz w:val="28"/>
-          <w:szCs w:val="28"/>
-          <w:lang w:val="en-US"/>
-        </w:rPr>
-        <w:br w:type="page"/>
+      <w:r>
+        <w:rPr>
+          <w:rFonts w:ascii="Arial" w:hAnsi="Arial" w:cs="Arial"/>
+          <w:sz w:val="28"/>
+          <w:szCs w:val="28"/>
+          <w:lang w:val="en-US"/>
+        </w:rPr>
+        <w:t>DATE, NOT NULL</w:t>
+      </w:r>
+    </w:p>
+    <w:p>
+      <w:pPr>
+        <w:pStyle w:val="ListParagraph"/>
+        <w:numPr>
+          <w:ilvl w:val="2"/>
+          <w:numId w:val="4"/>
+        </w:numPr>
+        <w:rPr>
+          <w:rFonts w:ascii="Arial" w:hAnsi="Arial" w:cs="Arial"/>
+          <w:sz w:val="28"/>
+          <w:szCs w:val="28"/>
+          <w:lang w:val="en-US"/>
+        </w:rPr>
+      </w:pPr>
+      <w:r>
+        <w:rPr>
+          <w:rFonts w:ascii="Arial" w:hAnsi="Arial" w:cs="Arial"/>
+          <w:sz w:val="28"/>
+          <w:szCs w:val="28"/>
+          <w:lang w:val="en-US"/>
+        </w:rPr>
+        <w:t>id_vet</w:t>
+      </w:r>
+      <w:r>
+        <w:rPr>
+          <w:rFonts w:ascii="Arial" w:hAnsi="Arial" w:cs="Arial"/>
+          <w:sz w:val="28"/>
+          <w:szCs w:val="28"/>
+          <w:lang w:val="en-US"/>
+        </w:rPr>
+        <w:t xml:space="preserve">: </w:t>
+      </w:r>
+      <w:r>
+        <w:rPr>
+          <w:rFonts w:ascii="Arial" w:hAnsi="Arial" w:cs="Arial"/>
+          <w:sz w:val="28"/>
+          <w:szCs w:val="28"/>
+          <w:lang w:val="en-US"/>
+        </w:rPr>
+        <w:t>INT</w:t>
+      </w:r>
+      <w:r>
+        <w:rPr>
+          <w:rFonts w:ascii="Arial" w:hAnsi="Arial" w:cs="Arial"/>
+          <w:sz w:val="28"/>
+          <w:szCs w:val="28"/>
+          <w:lang w:val="en-US"/>
+        </w:rPr>
+        <w:t>, FK</w:t>
+      </w:r>
+      <w:r>
+        <w:rPr>
+          <w:rFonts w:ascii="Arial" w:hAnsi="Arial" w:cs="Arial"/>
+          <w:sz w:val="28"/>
+          <w:szCs w:val="28"/>
+          <w:lang w:val="en-US"/>
+        </w:rPr>
+        <w:t>[vets]</w:t>
+      </w:r>
+      <w:r>
+        <w:rPr>
+          <w:rFonts w:ascii="Arial" w:hAnsi="Arial" w:cs="Arial"/>
+          <w:sz w:val="28"/>
+          <w:szCs w:val="28"/>
+          <w:lang w:val="en-US"/>
+        </w:rPr>
+        <w:t>, NOT NULL</w:t>
+      </w:r>
+    </w:p>
+    <w:p>
+      <w:pPr>
+        <w:pStyle w:val="ListParagraph"/>
+        <w:numPr>
+          <w:ilvl w:val="2"/>
+          <w:numId w:val="4"/>
+        </w:numPr>
+        <w:rPr>
+          <w:rFonts w:ascii="Arial" w:hAnsi="Arial" w:cs="Arial"/>
+          <w:sz w:val="28"/>
+          <w:szCs w:val="28"/>
+          <w:lang w:val="en-US"/>
+        </w:rPr>
+      </w:pPr>
+      <w:r>
+        <w:rPr>
+          <w:rFonts w:ascii="Arial" w:hAnsi="Arial" w:cs="Arial"/>
+          <w:sz w:val="28"/>
+          <w:szCs w:val="28"/>
+          <w:lang w:val="en-US"/>
+        </w:rPr>
+        <w:t>id_</w:t>
+      </w:r>
+      <w:r>
+        <w:rPr>
+          <w:rFonts w:ascii="Arial" w:hAnsi="Arial" w:cs="Arial"/>
+          <w:sz w:val="28"/>
+          <w:szCs w:val="28"/>
+          <w:lang w:val="en-US"/>
+        </w:rPr>
+        <w:t>owner</w:t>
+      </w:r>
+      <w:r>
+        <w:rPr>
+          <w:rFonts w:ascii="Arial" w:hAnsi="Arial" w:cs="Arial"/>
+          <w:sz w:val="28"/>
+          <w:szCs w:val="28"/>
+          <w:lang w:val="en-US"/>
+        </w:rPr>
+        <w:t xml:space="preserve">: </w:t>
+      </w:r>
+      <w:r>
+        <w:rPr>
+          <w:rFonts w:ascii="Arial" w:hAnsi="Arial" w:cs="Arial"/>
+          <w:sz w:val="28"/>
+          <w:szCs w:val="28"/>
+          <w:lang w:val="en-US"/>
+        </w:rPr>
+        <w:t>INT</w:t>
+      </w:r>
+      <w:r>
+        <w:rPr>
+          <w:rFonts w:ascii="Arial" w:hAnsi="Arial" w:cs="Arial"/>
+          <w:sz w:val="28"/>
+          <w:szCs w:val="28"/>
+          <w:lang w:val="en-US"/>
+        </w:rPr>
+        <w:t>, FK</w:t>
+      </w:r>
+      <w:r>
+        <w:rPr>
+          <w:rFonts w:ascii="Arial" w:hAnsi="Arial" w:cs="Arial"/>
+          <w:sz w:val="28"/>
+          <w:szCs w:val="28"/>
+          <w:lang w:val="en-US"/>
+        </w:rPr>
+        <w:t>[pet</w:t>
+      </w:r>
+      <w:r>
+        <w:rPr>
+          <w:rFonts w:ascii="Arial" w:hAnsi="Arial" w:cs="Arial"/>
+          <w:sz w:val="28"/>
+          <w:szCs w:val="28"/>
+          <w:lang w:val="en-US"/>
+        </w:rPr>
+        <w:t>_owners</w:t>
+      </w:r>
+      <w:r>
+        <w:rPr>
+          <w:rFonts w:ascii="Arial" w:hAnsi="Arial" w:cs="Arial"/>
+          <w:sz w:val="28"/>
+          <w:szCs w:val="28"/>
+          <w:lang w:val="en-US"/>
+        </w:rPr>
+        <w:t>]</w:t>
+      </w:r>
+      <w:r>
+        <w:rPr>
+          <w:rFonts w:ascii="Arial" w:hAnsi="Arial" w:cs="Arial"/>
+          <w:sz w:val="28"/>
+          <w:szCs w:val="28"/>
+          <w:lang w:val="en-US"/>
+        </w:rPr>
+        <w:t>, NOT NULL</w:t>
+      </w:r>
+    </w:p>
+    <w:p>
+      <w:pPr>
+        <w:pStyle w:val="ListParagraph"/>
+        <w:numPr>
+          <w:ilvl w:val="2"/>
+          <w:numId w:val="4"/>
+        </w:numPr>
+        <w:rPr>
+          <w:rFonts w:ascii="Arial" w:hAnsi="Arial" w:cs="Arial"/>
+          <w:sz w:val="28"/>
+          <w:szCs w:val="28"/>
+          <w:lang w:val="en-US"/>
+        </w:rPr>
+      </w:pPr>
+      <w:r>
+        <w:rPr>
+          <w:rFonts w:ascii="Arial" w:hAnsi="Arial" w:cs="Arial"/>
+          <w:sz w:val="28"/>
+          <w:szCs w:val="28"/>
+          <w:lang w:val="en-US"/>
+        </w:rPr>
+        <w:t xml:space="preserve">id_pet: </w:t>
+      </w:r>
+      <w:r>
+        <w:rPr>
+          <w:rFonts w:ascii="Arial" w:hAnsi="Arial" w:cs="Arial"/>
+          <w:sz w:val="28"/>
+          <w:szCs w:val="28"/>
+          <w:lang w:val="en-US"/>
+        </w:rPr>
+        <w:t>INT, FK[pet</w:t>
+      </w:r>
+      <w:r>
+        <w:rPr>
+          <w:rFonts w:ascii="Arial" w:hAnsi="Arial" w:cs="Arial"/>
+          <w:sz w:val="28"/>
+          <w:szCs w:val="28"/>
+          <w:lang w:val="en-US"/>
+        </w:rPr>
+        <w:t>s</w:t>
+      </w:r>
+      <w:r>
+        <w:rPr>
+          <w:rFonts w:ascii="Arial" w:hAnsi="Arial" w:cs="Arial"/>
+          <w:sz w:val="28"/>
+          <w:szCs w:val="28"/>
+          <w:lang w:val="en-US"/>
+        </w:rPr>
+        <w:t>], NOT NULL</w:t>
+      </w:r>
+    </w:p>
+    <w:p>
+      <w:pPr>
+        <w:pStyle w:val="ListParagraph"/>
+        <w:numPr>
+          <w:ilvl w:val="2"/>
+          <w:numId w:val="4"/>
+        </w:numPr>
+        <w:rPr>
+          <w:rFonts w:ascii="Arial" w:hAnsi="Arial" w:cs="Arial"/>
+          <w:sz w:val="28"/>
+          <w:szCs w:val="28"/>
+          <w:lang w:val="ru-RU"/>
+        </w:rPr>
+      </w:pPr>
+      <w:r>
+        <w:rPr>
+          <w:rFonts w:ascii="Arial" w:hAnsi="Arial" w:cs="Arial"/>
+          <w:sz w:val="28"/>
+          <w:szCs w:val="28"/>
+          <w:lang w:val="ru-RU"/>
+        </w:rPr>
+        <w:t>diagnosis</w:t>
+      </w:r>
+      <w:r>
+        <w:rPr>
+          <w:rFonts w:ascii="Arial" w:hAnsi="Arial" w:cs="Arial"/>
+          <w:sz w:val="28"/>
+          <w:szCs w:val="28"/>
+          <w:lang w:val="en-US"/>
+        </w:rPr>
+        <w:t>: TEXT, NOT NULL</w:t>
       </w:r>
     </w:p>
     <w:p>
@@ -1316,7 +1750,6 @@
           <w:szCs w:val="28"/>
           <w:lang w:val="en-US"/>
         </w:rPr>
-        <w:lastRenderedPageBreak/>
         <w:t xml:space="preserve">Table name – </w:t>
       </w:r>
       <w:r>
@@ -1326,7 +1759,25 @@
           <w:szCs w:val="28"/>
           <w:lang w:val="en-US"/>
         </w:rPr>
-        <w:t>appointments</w:t>
+        <w:t>bil</w:t>
+      </w:r>
+      <w:r>
+        <w:rPr>
+          <w:rFonts w:ascii="Arial" w:hAnsi="Arial" w:cs="Arial"/>
+          <w:sz w:val="28"/>
+          <w:szCs w:val="28"/>
+          <w:lang w:val="en-US"/>
+        </w:rPr>
+        <w:t>l</w:t>
+      </w:r>
+      <w:r>
+        <w:rPr>
+          <w:rFonts w:ascii="Arial" w:hAnsi="Arial" w:cs="Arial"/>
+          <w:sz w:val="28"/>
+          <w:szCs w:val="28"/>
+          <w:lang w:val="en-US"/>
+        </w:rPr>
+        <w:t>s</w:t>
       </w:r>
     </w:p>
     <w:p>
@@ -1379,25 +1830,7 @@
           <w:szCs w:val="28"/>
           <w:lang w:val="ru-RU"/>
         </w:rPr>
-        <w:t>приемах к ветерин</w:t>
-      </w:r>
-      <w:r>
-        <w:rPr>
-          <w:rFonts w:ascii="Arial" w:hAnsi="Arial" w:cs="Arial"/>
-          <w:sz w:val="28"/>
-          <w:szCs w:val="28"/>
-          <w:lang w:val="ru-RU"/>
-        </w:rPr>
-        <w:t>а</w:t>
-      </w:r>
-      <w:r>
-        <w:rPr>
-          <w:rFonts w:ascii="Arial" w:hAnsi="Arial" w:cs="Arial"/>
-          <w:sz w:val="28"/>
-          <w:szCs w:val="28"/>
-          <w:lang w:val="ru-RU"/>
-        </w:rPr>
-        <w:t>ру</w:t>
+        <w:t>счетах за прием</w:t>
       </w:r>
     </w:p>
     <w:p>
@@ -1453,7 +1886,6 @@
           <w:lang w:val="en-US"/>
         </w:rPr>
       </w:pPr>
-      <w:proofErr w:type="spellStart"/>
       <w:r>
         <w:rPr>
           <w:rFonts w:ascii="Arial" w:hAnsi="Arial" w:cs="Arial"/>
@@ -1470,17 +1902,34 @@
           <w:szCs w:val="28"/>
           <w:lang w:val="en-US"/>
         </w:rPr>
-        <w:t>appointment</w:t>
-      </w:r>
-      <w:proofErr w:type="spellEnd"/>
-      <w:r>
-        <w:rPr>
-          <w:rFonts w:ascii="Arial" w:hAnsi="Arial" w:cs="Arial"/>
-          <w:sz w:val="28"/>
-          <w:szCs w:val="28"/>
-          <w:lang w:val="en-US"/>
-        </w:rPr>
-        <w:t>: INT, PK, NOT NULL, AUTO INCREMENT, UNIQUE</w:t>
+        <w:t>bill</w:t>
+      </w:r>
+      <w:r>
+        <w:rPr>
+          <w:rFonts w:ascii="Arial" w:hAnsi="Arial" w:cs="Arial"/>
+          <w:sz w:val="28"/>
+          <w:szCs w:val="28"/>
+          <w:lang w:val="en-US"/>
+        </w:rPr>
+        <w:t xml:space="preserve">: INT, PK, NOT NULL, </w:t>
+      </w:r>
+      <w:r>
+        <w:rPr>
+          <w:rFonts w:ascii="Arial" w:hAnsi="Arial" w:cs="Arial"/>
+          <w:sz w:val="28"/>
+          <w:szCs w:val="28"/>
+          <w:lang w:val="en-US"/>
+        </w:rPr>
+        <w:t>SERIAL</w:t>
+      </w:r>
+      <w:r>
+        <w:rPr>
+          <w:rFonts w:ascii="Arial" w:hAnsi="Arial" w:cs="Arial"/>
+          <w:sz w:val="28"/>
+          <w:szCs w:val="28"/>
+          <w:lang w:val="en-US"/>
+        </w:rPr>
+        <w:t>, UNIQUE</w:t>
       </w:r>
     </w:p>
     <w:p>
@@ -1504,7 +1953,7 @@
           <w:szCs w:val="28"/>
           <w:lang w:val="en-US"/>
         </w:rPr>
-        <w:t>date</w:t>
+        <w:t>price</w:t>
       </w:r>
       <w:r>
         <w:rPr>
@@ -1522,7 +1971,25 @@
           <w:szCs w:val="28"/>
           <w:lang w:val="en-US"/>
         </w:rPr>
-        <w:t>DATE, NOT NULL</w:t>
+        <w:t>NUMERIC</w:t>
+      </w:r>
+      <w:r>
+        <w:rPr>
+          <w:rFonts w:ascii="Arial" w:hAnsi="Arial" w:cs="Arial"/>
+          <w:sz w:val="28"/>
+          <w:szCs w:val="28"/>
+          <w:lang w:val="en-US"/>
+        </w:rPr>
+        <w:t>, NOT NULL</w:t>
+      </w:r>
+      <w:r>
+        <w:rPr>
+          <w:rFonts w:ascii="Arial" w:hAnsi="Arial" w:cs="Arial"/>
+          <w:sz w:val="28"/>
+          <w:szCs w:val="28"/>
+          <w:lang w:val="en-US"/>
+        </w:rPr>
+        <w:t>, CHECK (price &gt; 0)</w:t>
       </w:r>
     </w:p>
     <w:p>
@@ -1539,17 +2006,15 @@
           <w:lang w:val="en-US"/>
         </w:rPr>
       </w:pPr>
-      <w:proofErr w:type="spellStart"/>
-      <w:r>
-        <w:rPr>
-          <w:rFonts w:ascii="Arial" w:hAnsi="Arial" w:cs="Arial"/>
-          <w:sz w:val="28"/>
-          <w:szCs w:val="28"/>
-          <w:lang w:val="en-US"/>
-        </w:rPr>
-        <w:t>id_vet</w:t>
-      </w:r>
-      <w:proofErr w:type="spellEnd"/>
+      <w:r>
+        <w:rPr>
+          <w:rFonts w:ascii="Arial" w:hAnsi="Arial" w:cs="Arial"/>
+          <w:sz w:val="28"/>
+          <w:szCs w:val="28"/>
+          <w:lang w:val="en-US"/>
+        </w:rPr>
+        <w:t>id_appointment</w:t>
+      </w:r>
       <w:r>
         <w:rPr>
           <w:rFonts w:ascii="Arial" w:hAnsi="Arial" w:cs="Arial"/>
@@ -1575,469 +2040,16 @@
           <w:szCs w:val="28"/>
           <w:lang w:val="en-US"/>
         </w:rPr>
-        <w:t xml:space="preserve">, </w:t>
-      </w:r>
-      <w:proofErr w:type="gramStart"/>
-      <w:r>
-        <w:rPr>
-          <w:rFonts w:ascii="Arial" w:hAnsi="Arial" w:cs="Arial"/>
-          <w:sz w:val="28"/>
-          <w:szCs w:val="28"/>
-          <w:lang w:val="en-US"/>
-        </w:rPr>
-        <w:t>FK</w:t>
-      </w:r>
-      <w:r>
-        <w:rPr>
-          <w:rFonts w:ascii="Arial" w:hAnsi="Arial" w:cs="Arial"/>
-          <w:sz w:val="28"/>
-          <w:szCs w:val="28"/>
-          <w:lang w:val="en-US"/>
-        </w:rPr>
-        <w:t>[</w:t>
-      </w:r>
-      <w:proofErr w:type="gramEnd"/>
-      <w:r>
-        <w:rPr>
-          <w:rFonts w:ascii="Arial" w:hAnsi="Arial" w:cs="Arial"/>
-          <w:sz w:val="28"/>
-          <w:szCs w:val="28"/>
-          <w:lang w:val="en-US"/>
-        </w:rPr>
-        <w:t>vets]</w:t>
-      </w:r>
-      <w:r>
-        <w:rPr>
-          <w:rFonts w:ascii="Arial" w:hAnsi="Arial" w:cs="Arial"/>
-          <w:sz w:val="28"/>
-          <w:szCs w:val="28"/>
-          <w:lang w:val="en-US"/>
-        </w:rPr>
-        <w:t>, NOT NULL</w:t>
-      </w:r>
-    </w:p>
-    <w:p>
-      <w:pPr>
-        <w:pStyle w:val="ListParagraph"/>
-        <w:numPr>
-          <w:ilvl w:val="2"/>
-          <w:numId w:val="4"/>
-        </w:numPr>
-        <w:rPr>
-          <w:rFonts w:ascii="Arial" w:hAnsi="Arial" w:cs="Arial"/>
-          <w:sz w:val="28"/>
-          <w:szCs w:val="28"/>
-          <w:lang w:val="en-US"/>
-        </w:rPr>
-      </w:pPr>
-      <w:proofErr w:type="spellStart"/>
-      <w:r>
-        <w:rPr>
-          <w:rFonts w:ascii="Arial" w:hAnsi="Arial" w:cs="Arial"/>
-          <w:sz w:val="28"/>
-          <w:szCs w:val="28"/>
-          <w:lang w:val="en-US"/>
-        </w:rPr>
-        <w:t>id_</w:t>
-      </w:r>
-      <w:r>
-        <w:rPr>
-          <w:rFonts w:ascii="Arial" w:hAnsi="Arial" w:cs="Arial"/>
-          <w:sz w:val="28"/>
-          <w:szCs w:val="28"/>
-          <w:lang w:val="en-US"/>
-        </w:rPr>
-        <w:t>owner</w:t>
-      </w:r>
-      <w:proofErr w:type="spellEnd"/>
-      <w:r>
-        <w:rPr>
-          <w:rFonts w:ascii="Arial" w:hAnsi="Arial" w:cs="Arial"/>
-          <w:sz w:val="28"/>
-          <w:szCs w:val="28"/>
-          <w:lang w:val="en-US"/>
-        </w:rPr>
-        <w:t xml:space="preserve">: </w:t>
-      </w:r>
-      <w:r>
-        <w:rPr>
-          <w:rFonts w:ascii="Arial" w:hAnsi="Arial" w:cs="Arial"/>
-          <w:sz w:val="28"/>
-          <w:szCs w:val="28"/>
-          <w:lang w:val="en-US"/>
-        </w:rPr>
-        <w:t>INT</w:t>
-      </w:r>
-      <w:r>
-        <w:rPr>
-          <w:rFonts w:ascii="Arial" w:hAnsi="Arial" w:cs="Arial"/>
-          <w:sz w:val="28"/>
-          <w:szCs w:val="28"/>
-          <w:lang w:val="en-US"/>
-        </w:rPr>
-        <w:t xml:space="preserve">, </w:t>
-      </w:r>
-      <w:proofErr w:type="gramStart"/>
-      <w:r>
-        <w:rPr>
-          <w:rFonts w:ascii="Arial" w:hAnsi="Arial" w:cs="Arial"/>
-          <w:sz w:val="28"/>
-          <w:szCs w:val="28"/>
-          <w:lang w:val="en-US"/>
-        </w:rPr>
-        <w:t>FK</w:t>
-      </w:r>
-      <w:r>
-        <w:rPr>
-          <w:rFonts w:ascii="Arial" w:hAnsi="Arial" w:cs="Arial"/>
-          <w:sz w:val="28"/>
-          <w:szCs w:val="28"/>
-          <w:lang w:val="en-US"/>
-        </w:rPr>
-        <w:t>[</w:t>
-      </w:r>
-      <w:proofErr w:type="spellStart"/>
-      <w:proofErr w:type="gramEnd"/>
-      <w:r>
-        <w:rPr>
-          <w:rFonts w:ascii="Arial" w:hAnsi="Arial" w:cs="Arial"/>
-          <w:sz w:val="28"/>
-          <w:szCs w:val="28"/>
-          <w:lang w:val="en-US"/>
-        </w:rPr>
-        <w:t>pet</w:t>
-      </w:r>
-      <w:r>
-        <w:rPr>
-          <w:rFonts w:ascii="Arial" w:hAnsi="Arial" w:cs="Arial"/>
-          <w:sz w:val="28"/>
-          <w:szCs w:val="28"/>
-          <w:lang w:val="en-US"/>
-        </w:rPr>
-        <w:t>_owners</w:t>
-      </w:r>
-      <w:proofErr w:type="spellEnd"/>
-      <w:r>
-        <w:rPr>
-          <w:rFonts w:ascii="Arial" w:hAnsi="Arial" w:cs="Arial"/>
-          <w:sz w:val="28"/>
-          <w:szCs w:val="28"/>
-          <w:lang w:val="en-US"/>
-        </w:rPr>
-        <w:t>]</w:t>
-      </w:r>
-      <w:r>
-        <w:rPr>
-          <w:rFonts w:ascii="Arial" w:hAnsi="Arial" w:cs="Arial"/>
-          <w:sz w:val="28"/>
-          <w:szCs w:val="28"/>
-          <w:lang w:val="en-US"/>
-        </w:rPr>
-        <w:t>, NOT NULL</w:t>
-      </w:r>
-    </w:p>
-    <w:p>
-      <w:pPr>
-        <w:pStyle w:val="ListParagraph"/>
-        <w:numPr>
-          <w:ilvl w:val="0"/>
-          <w:numId w:val="4"/>
-        </w:numPr>
-        <w:rPr>
-          <w:rFonts w:ascii="Arial" w:hAnsi="Arial" w:cs="Arial"/>
-          <w:sz w:val="28"/>
-          <w:szCs w:val="28"/>
-          <w:lang w:val="en-US"/>
-        </w:rPr>
-      </w:pPr>
-      <w:r>
-        <w:rPr>
-          <w:rFonts w:ascii="Arial" w:hAnsi="Arial" w:cs="Arial"/>
-          <w:sz w:val="28"/>
-          <w:szCs w:val="28"/>
-          <w:lang w:val="en-US"/>
-        </w:rPr>
-        <w:t xml:space="preserve">Table name – </w:t>
-      </w:r>
-      <w:proofErr w:type="spellStart"/>
-      <w:r>
-        <w:rPr>
-          <w:rFonts w:ascii="Arial" w:hAnsi="Arial" w:cs="Arial"/>
-          <w:sz w:val="28"/>
-          <w:szCs w:val="28"/>
-          <w:lang w:val="en-US"/>
-        </w:rPr>
-        <w:t>bils</w:t>
-      </w:r>
-      <w:proofErr w:type="spellEnd"/>
-    </w:p>
-    <w:p>
-      <w:pPr>
-        <w:pStyle w:val="ListParagraph"/>
-        <w:numPr>
-          <w:ilvl w:val="1"/>
-          <w:numId w:val="4"/>
-        </w:numPr>
-        <w:rPr>
-          <w:rFonts w:ascii="Arial" w:hAnsi="Arial" w:cs="Arial"/>
-          <w:sz w:val="28"/>
-          <w:szCs w:val="28"/>
-          <w:lang w:val="ru-RU"/>
-        </w:rPr>
-      </w:pPr>
-      <w:r>
-        <w:rPr>
-          <w:rFonts w:ascii="Arial" w:hAnsi="Arial" w:cs="Arial"/>
-          <w:i/>
-          <w:iCs/>
-          <w:sz w:val="28"/>
-          <w:szCs w:val="28"/>
-          <w:lang w:val="en-US"/>
-        </w:rPr>
-        <w:t>Description</w:t>
-      </w:r>
-      <w:r>
-        <w:rPr>
-          <w:rFonts w:ascii="Arial" w:hAnsi="Arial" w:cs="Arial"/>
-          <w:sz w:val="28"/>
-          <w:szCs w:val="28"/>
-          <w:lang w:val="ru-RU"/>
-        </w:rPr>
-        <w:t xml:space="preserve">: </w:t>
-      </w:r>
-      <w:r>
-        <w:rPr>
-          <w:rFonts w:ascii="Arial" w:hAnsi="Arial" w:cs="Arial"/>
-          <w:sz w:val="28"/>
-          <w:szCs w:val="28"/>
-          <w:lang w:val="ru-RU"/>
-        </w:rPr>
-        <w:t xml:space="preserve">хранит информацию о </w:t>
-      </w:r>
-      <w:r>
-        <w:rPr>
-          <w:rFonts w:ascii="Arial" w:hAnsi="Arial" w:cs="Arial"/>
-          <w:sz w:val="28"/>
-          <w:szCs w:val="28"/>
-          <w:lang w:val="ru-RU"/>
-        </w:rPr>
-        <w:t>счетах за прием</w:t>
-      </w:r>
-    </w:p>
-    <w:p>
-      <w:pPr>
-        <w:pStyle w:val="ListParagraph"/>
-        <w:numPr>
-          <w:ilvl w:val="1"/>
-          <w:numId w:val="4"/>
-        </w:numPr>
-        <w:rPr>
-          <w:rFonts w:ascii="Arial" w:hAnsi="Arial" w:cs="Arial"/>
-          <w:i/>
-          <w:iCs/>
-          <w:sz w:val="28"/>
-          <w:szCs w:val="28"/>
-          <w:lang w:val="ru-RU"/>
-        </w:rPr>
-      </w:pPr>
-      <w:r>
-        <w:rPr>
-          <w:rFonts w:ascii="Arial" w:hAnsi="Arial" w:cs="Arial"/>
-          <w:i/>
-          <w:iCs/>
-          <w:sz w:val="28"/>
-          <w:szCs w:val="28"/>
-          <w:lang w:val="en-US"/>
-        </w:rPr>
-        <w:t>Attributes</w:t>
-      </w:r>
-      <w:r>
-        <w:rPr>
-          <w:rFonts w:ascii="Arial" w:hAnsi="Arial" w:cs="Arial"/>
-          <w:i/>
-          <w:iCs/>
-          <w:sz w:val="28"/>
-          <w:szCs w:val="28"/>
-          <w:lang w:val="en-US"/>
-        </w:rPr>
-        <w:t>:</w:t>
-      </w:r>
-    </w:p>
-    <w:p>
-      <w:pPr>
-        <w:pStyle w:val="ListParagraph"/>
-        <w:numPr>
-          <w:ilvl w:val="2"/>
-          <w:numId w:val="4"/>
-        </w:numPr>
-        <w:rPr>
-          <w:rFonts w:ascii="Arial" w:hAnsi="Arial" w:cs="Arial"/>
-          <w:sz w:val="28"/>
-          <w:szCs w:val="28"/>
-          <w:lang w:val="en-US"/>
-        </w:rPr>
-      </w:pPr>
-      <w:proofErr w:type="spellStart"/>
-      <w:r>
-        <w:rPr>
-          <w:rFonts w:ascii="Arial" w:hAnsi="Arial" w:cs="Arial"/>
-          <w:sz w:val="28"/>
-          <w:szCs w:val="28"/>
-          <w:lang w:val="en-US"/>
-        </w:rPr>
-        <w:t>id_</w:t>
-      </w:r>
-      <w:r>
-        <w:rPr>
-          <w:rFonts w:ascii="Arial" w:hAnsi="Arial" w:cs="Arial"/>
-          <w:sz w:val="28"/>
-          <w:szCs w:val="28"/>
-          <w:lang w:val="en-US"/>
-        </w:rPr>
-        <w:t>bill</w:t>
-      </w:r>
-      <w:proofErr w:type="spellEnd"/>
-      <w:r>
-        <w:rPr>
-          <w:rFonts w:ascii="Arial" w:hAnsi="Arial" w:cs="Arial"/>
-          <w:sz w:val="28"/>
-          <w:szCs w:val="28"/>
-          <w:lang w:val="en-US"/>
-        </w:rPr>
-        <w:t>: INT, PK, NOT NULL, AUTO INCREMENT, UNIQUE</w:t>
-      </w:r>
-    </w:p>
-    <w:p>
-      <w:pPr>
-        <w:pStyle w:val="ListParagraph"/>
-        <w:numPr>
-          <w:ilvl w:val="2"/>
-          <w:numId w:val="4"/>
-        </w:numPr>
-        <w:rPr>
-          <w:rFonts w:ascii="Arial" w:hAnsi="Arial" w:cs="Arial"/>
-          <w:sz w:val="28"/>
-          <w:szCs w:val="28"/>
-          <w:lang w:val="en-US"/>
-        </w:rPr>
-      </w:pPr>
-      <w:r>
-        <w:rPr>
-          <w:rFonts w:ascii="Arial" w:hAnsi="Arial" w:cs="Arial"/>
-          <w:sz w:val="28"/>
-          <w:szCs w:val="28"/>
-          <w:lang w:val="en-US"/>
-        </w:rPr>
-        <w:t>price</w:t>
-      </w:r>
-      <w:r>
-        <w:rPr>
-          <w:rFonts w:ascii="Arial" w:hAnsi="Arial" w:cs="Arial"/>
-          <w:sz w:val="28"/>
-          <w:szCs w:val="28"/>
-          <w:lang w:val="en-US"/>
-        </w:rPr>
-        <w:t xml:space="preserve">: </w:t>
-      </w:r>
-      <w:r>
-        <w:rPr>
-          <w:rFonts w:ascii="Arial" w:hAnsi="Arial" w:cs="Arial"/>
-          <w:sz w:val="28"/>
-          <w:szCs w:val="28"/>
-          <w:lang w:val="en-US"/>
-        </w:rPr>
-        <w:t>MONEY</w:t>
-      </w:r>
-      <w:r>
-        <w:rPr>
-          <w:rFonts w:ascii="Arial" w:hAnsi="Arial" w:cs="Arial"/>
-          <w:sz w:val="28"/>
-          <w:szCs w:val="28"/>
-          <w:lang w:val="en-US"/>
-        </w:rPr>
-        <w:t>, NOT NULL</w:t>
-      </w:r>
-    </w:p>
-    <w:p>
-      <w:pPr>
-        <w:pStyle w:val="ListParagraph"/>
-        <w:numPr>
-          <w:ilvl w:val="2"/>
-          <w:numId w:val="4"/>
-        </w:numPr>
-        <w:rPr>
-          <w:rFonts w:ascii="Arial" w:hAnsi="Arial" w:cs="Arial"/>
-          <w:sz w:val="28"/>
-          <w:szCs w:val="28"/>
-          <w:lang w:val="en-US"/>
-        </w:rPr>
-      </w:pPr>
-      <w:proofErr w:type="spellStart"/>
-      <w:r>
-        <w:rPr>
-          <w:rFonts w:ascii="Arial" w:hAnsi="Arial" w:cs="Arial"/>
-          <w:sz w:val="28"/>
-          <w:szCs w:val="28"/>
-          <w:lang w:val="en-US"/>
-        </w:rPr>
-        <w:t>id_appointment</w:t>
-      </w:r>
-      <w:proofErr w:type="spellEnd"/>
-      <w:r>
-        <w:rPr>
-          <w:rFonts w:ascii="Arial" w:hAnsi="Arial" w:cs="Arial"/>
-          <w:sz w:val="28"/>
-          <w:szCs w:val="28"/>
-          <w:lang w:val="en-US"/>
-        </w:rPr>
-        <w:t xml:space="preserve">: </w:t>
-      </w:r>
-      <w:r>
-        <w:rPr>
-          <w:rFonts w:ascii="Arial" w:hAnsi="Arial" w:cs="Arial"/>
-          <w:sz w:val="28"/>
-          <w:szCs w:val="28"/>
-          <w:lang w:val="en-US"/>
-        </w:rPr>
-        <w:t>INT</w:t>
-      </w:r>
-      <w:r>
-        <w:rPr>
-          <w:rFonts w:ascii="Arial" w:hAnsi="Arial" w:cs="Arial"/>
-          <w:sz w:val="28"/>
-          <w:szCs w:val="28"/>
-          <w:lang w:val="en-US"/>
-        </w:rPr>
-        <w:t xml:space="preserve">, </w:t>
-      </w:r>
-      <w:proofErr w:type="gramStart"/>
-      <w:r>
-        <w:rPr>
-          <w:rFonts w:ascii="Arial" w:hAnsi="Arial" w:cs="Arial"/>
-          <w:sz w:val="28"/>
-          <w:szCs w:val="28"/>
-          <w:lang w:val="en-US"/>
-        </w:rPr>
-        <w:t>FK</w:t>
-      </w:r>
-      <w:r>
-        <w:rPr>
-          <w:rFonts w:ascii="Arial" w:hAnsi="Arial" w:cs="Arial"/>
-          <w:sz w:val="28"/>
-          <w:szCs w:val="28"/>
-          <w:lang w:val="en-US"/>
-        </w:rPr>
-        <w:t>[</w:t>
-      </w:r>
-      <w:proofErr w:type="gramEnd"/>
-      <w:r>
-        <w:rPr>
-          <w:rFonts w:ascii="Arial" w:hAnsi="Arial" w:cs="Arial"/>
-          <w:sz w:val="28"/>
-          <w:szCs w:val="28"/>
-          <w:lang w:val="en-US"/>
-        </w:rPr>
-        <w:t>appointments]</w:t>
+        <w:t>, FK</w:t>
+      </w:r>
+      <w:r>
+        <w:rPr>
+          <w:rFonts w:ascii="Arial" w:hAnsi="Arial" w:cs="Arial"/>
+          <w:sz w:val="28"/>
+          <w:szCs w:val="28"/>
+          <w:lang w:val="en-US"/>
+        </w:rPr>
+        <w:t>[appointments]</w:t>
       </w:r>
       <w:r>
         <w:rPr>

</xml_diff>